<commit_message>
Add Vivosun pH measurements to database and summary (School St, Lincoln Pool, Atwater)
</commit_message>
<xml_diff>
--- a/output/MBTS_eDNA_Summary_v1.docx
+++ b/output/MBTS_eDNA_Summary_v1.docx
@@ -86,7 +86,7 @@
           <w:color w:val="00467F"/>
           <w:sz w:val="20"/>
         </w:rPr>
-        <w:t>3.  pH</w:t>
+        <w:t>3.  pH  (Vivosun meter, two-point calibration, ±0.2 pH unit)</w:t>
       </w:r>
     </w:p>
     <w:p>
@@ -97,7 +97,7 @@
         <w:rPr>
           <w:sz w:val="17"/>
         </w:rPr>
-        <w:t>No field pH measurements are available in the database for any of the 14 MBTS samples. This is a significant data gap. Rhopalodia inflata (N-fixing diatom) at multiple main-stem sites and Eunotia naegelii dominance throughout indicate nitrogen-limited, soft, low-pH conditions typical of New England Brook Trout habitat — but no direct measurement confirms this. Priority sites for pH monitoring: Second Pond (eutrophication severity assessment), MBTS #3 (Brown Trout stocking context), Golf Course reach (Brook Trout spawning corridor), and Sawmill Swamp. A single seasonal Sonde deployment or grab-sample run would close this gap.</w:t>
+        <w:t>Eight Vivosun field measurements are available across three Sawmill Brook sites. All fall within Brook Trout tolerance (6.5–7.5 optimal). Range: 6.15–7.05. Average: 6.66. School St: pH 7.05 / 71.6°F (Jul 2025) — pH optimal but temperature at the upper Brook Trout stress threshold (~68°F); pH 6.66 / 38.4°F (Nov 2025, co-dated with eDNA) — full tolerance, Brook Trout detected at 4.8%. Below Lincoln Pool: pH 6.88 / 55.4°F (Jun 2025, co-collected with eDNA) — optimal; Brook Trout detected at 0.6%. pH 6.53 / 37.7°F (Nov 2025) — winter baseline, full tolerance. Atwater: pH 6.15 / 62.7°F (Jun 2025, co-collected with eDNA) — low end of optimal, borderline for spawning habitat; pH 6.47 / 75.9°F (Jul 2025) — acute thermal stress, above short-term BT lethal threshold; pH 6.87 / 36.8°F (Nov 2025). No pH data for Second Pond, Cat Brook, Golf Course, Elm Street, MBTS #3, Sawmill Swamp, or Fire Station — priority gap sites for future Sonde or grab-sample measurement.</w:t>
       </w:r>
     </w:p>
     <w:p>

</xml_diff>